<commit_message>
Included decimal point to W3. Added new data and analysis to W4
</commit_message>
<xml_diff>
--- a/Workshops/Workshop 3 - LM with continuous predictor/Workshop-3---LM-with-a-continuous-predictor--with-answers-.docx
+++ b/Workshops/Workshop 3 - LM with continuous predictor/Workshop-3---LM-with-a-continuous-predictor--with-answers-.docx
@@ -95,7 +95,7 @@
         <w:t xml:space="preserve"> </w:t>
       </w:r>
       <w:r>
-        <w:t xml:space="preserve">2025-08-22</w:t>
+        <w:t xml:space="preserve">2025-09-04</w:t>
       </w:r>
     </w:p>
     <w:sdt>
@@ -3924,13 +3924,13 @@
       </w:r>
     </w:p>
     <w:bookmarkEnd w:id="35"/>
-    <w:bookmarkStart w:id="44" w:name="summarise-the-results."/>
+    <w:bookmarkStart w:id="42" w:name="extra-how-many-decimal-points"/>
     <w:p>
       <w:pPr>
         <w:pStyle w:val="Heading1"/>
       </w:pPr>
       <w:r>
-        <w:t xml:space="preserve">6. Summarise the results.</w:t>
+        <w:t xml:space="preserve">Extra: How many decimal points?</w:t>
       </w:r>
     </w:p>
     <w:p>
@@ -3938,90 +3938,7 @@
         <w:pStyle w:val="FirstParagraph"/>
       </w:pPr>
       <w:r>
-        <w:t xml:space="preserve">We’ll come back to</w:t>
-      </w:r>
-      <w:r>
-        <w:t xml:space="preserve"> </w:t>
-      </w:r>
-      <w:r>
-        <w:t xml:space="preserve">“</w:t>
-      </w:r>
-      <w:r>
-        <w:t xml:space="preserve">5. Diagnose the model and check assumptions.</w:t>
-      </w:r>
-      <w:r>
-        <w:t xml:space="preserve">”</w:t>
-      </w:r>
-      <w:r>
-        <w:t xml:space="preserve"> </w:t>
-      </w:r>
-      <w:r>
-        <w:t xml:space="preserve">on Friday. For today we’ll go through how to take these results and convert them into a figure.</w:t>
-      </w:r>
-    </w:p>
-    <w:p>
-      <w:pPr>
-        <w:pStyle w:val="BodyText"/>
-      </w:pPr>
-      <w:r>
-        <w:t xml:space="preserve">To do so we’ll show you two options.</w:t>
-      </w:r>
-    </w:p>
-    <w:p>
-      <w:pPr>
-        <w:numPr>
-          <w:ilvl w:val="0"/>
-          <w:numId w:val="1016"/>
-        </w:numPr>
-      </w:pPr>
-      <w:r>
-        <w:t xml:space="preserve">Option 1: Use an</w:t>
-      </w:r>
-      <w:r>
-        <w:t xml:space="preserve"> </w:t>
-      </w:r>
-      <w:r>
-        <w:rPr>
-          <w:rStyle w:val="VerbatimChar"/>
-        </w:rPr>
-        <w:t xml:space="preserve">R</w:t>
-      </w:r>
-      <w:r>
-        <w:t xml:space="preserve"> </w:t>
-      </w:r>
-      <w:r>
-        <w:t xml:space="preserve">package to create the figure for you.</w:t>
-      </w:r>
-    </w:p>
-    <w:p>
-      <w:pPr>
-        <w:numPr>
-          <w:ilvl w:val="0"/>
-          <w:numId w:val="1016"/>
-        </w:numPr>
-      </w:pPr>
-      <w:r>
-        <w:t xml:space="preserve">Option 2: Create the prediction and figure yourself.</w:t>
-      </w:r>
-    </w:p>
-    <w:p>
-      <w:pPr>
-        <w:pStyle w:val="FirstParagraph"/>
-      </w:pPr>
-      <w:r>
-        <w:t xml:space="preserve">Option 1 is nice because it’s really quick and easy. The downside, though, is that you don’t get much control in what the figure looks like, and these packages can often obscure what’s going on, leading to confusion (e.g. </w:t>
-      </w:r>
-      <w:r>
-        <w:t xml:space="preserve">“</w:t>
-      </w:r>
-      <w:r>
-        <w:t xml:space="preserve">How did you make this figure?</w:t>
-      </w:r>
-      <w:r>
-        <w:t xml:space="preserve">”</w:t>
-      </w:r>
-      <w:r>
-        <w:t xml:space="preserve">.</w:t>
+        <w:t xml:space="preserve">Generally, when we work with summaries of data and estimates, these won’t be integers (i.e. whole numbers, 1, 2, 3) but will be</w:t>
       </w:r>
       <w:r>
         <w:t xml:space="preserve"> </w:t>
@@ -4031,242 +3948,36 @@
           <w:iCs/>
           <w:i/>
         </w:rPr>
-        <w:t xml:space="preserve">shrug</w:t>
-      </w:r>
-      <w:r>
-        <w:t xml:space="preserve">.).</w:t>
+        <w:t xml:space="preserve">floating</w:t>
+      </w:r>
+      <w:r>
+        <w:t xml:space="preserve"> </w:t>
+      </w:r>
+      <w:r>
+        <w:t xml:space="preserve">numbers (i.e. numbers with decimal points, 1.1, 2.032, 3.14). A common question is,</w:t>
+      </w:r>
+      <w:r>
+        <w:t xml:space="preserve"> </w:t>
+      </w:r>
+      <w:r>
+        <w:t xml:space="preserve">“</w:t>
+      </w:r>
+      <w:r>
+        <w:t xml:space="preserve">How many decimal points should I use and report?</w:t>
+      </w:r>
+      <w:r>
+        <w:t xml:space="preserve">”</w:t>
+      </w:r>
+      <w:r>
+        <w:t xml:space="preserve"> </w:t>
+      </w:r>
+      <w:r>
+        <w:t xml:space="preserve">There is no singularly correct answer. It depends on context. For example, in the next step of this workshop you’ll be using parameter estimates to create figures showing your predicted relationship. If you were to do this by hand, should you use zero decimal points or one hundred? Let’s see what difference it makes with a hypothetical model.</w:t>
       </w:r>
     </w:p>
     <w:p>
       <w:pPr>
         <w:pStyle w:val="BodyText"/>
-      </w:pPr>
-      <w:r>
-        <w:t xml:space="preserve">Option 2, on the other hand, can be more fiddly, but has the benefit of giving you flexibility, and makes the underlying process pretty transparent.</w:t>
-      </w:r>
-    </w:p>
-    <w:p>
-      <w:pPr>
-        <w:pStyle w:val="BodyText"/>
-      </w:pPr>
-      <w:r>
-        <w:t xml:space="preserve">We’ll start with Option 1.</w:t>
-      </w:r>
-    </w:p>
-    <w:bookmarkStart w:id="39" w:name="X904265fd1c38f657b0a0512398af9fee0fe9262"/>
-    <w:p>
-      <w:pPr>
-        <w:pStyle w:val="Heading2"/>
-      </w:pPr>
-      <w:r>
-        <w:t xml:space="preserve">Use an</w:t>
-      </w:r>
-      <w:r>
-        <w:t xml:space="preserve"> </w:t>
-      </w:r>
-      <w:r>
-        <w:rPr>
-          <w:rStyle w:val="VerbatimChar"/>
-        </w:rPr>
-        <w:t xml:space="preserve">R</w:t>
-      </w:r>
-      <w:r>
-        <w:t xml:space="preserve"> </w:t>
-      </w:r>
-      <w:r>
-        <w:t xml:space="preserve">package to create the figure for you.</w:t>
-      </w:r>
-    </w:p>
-    <w:p>
-      <w:pPr>
-        <w:pStyle w:val="FirstParagraph"/>
-      </w:pPr>
-      <w:r>
-        <w:t xml:space="preserve">First, install a package called</w:t>
-      </w:r>
-      <w:r>
-        <w:t xml:space="preserve"> </w:t>
-      </w:r>
-      <w:r>
-        <w:rPr>
-          <w:rStyle w:val="VerbatimChar"/>
-        </w:rPr>
-        <w:t xml:space="preserve">ggeffects</w:t>
-      </w:r>
-      <w:r>
-        <w:t xml:space="preserve">:</w:t>
-      </w:r>
-    </w:p>
-    <w:p>
-      <w:pPr>
-        <w:pStyle w:val="SourceCode"/>
-      </w:pPr>
-      <w:r>
-        <w:rPr>
-          <w:rStyle w:val="FunctionTok"/>
-        </w:rPr>
-        <w:t xml:space="preserve">install.packages</w:t>
-      </w:r>
-      <w:r>
-        <w:rPr>
-          <w:rStyle w:val="NormalTok"/>
-        </w:rPr>
-        <w:t xml:space="preserve">(</w:t>
-      </w:r>
-      <w:r>
-        <w:rPr>
-          <w:rStyle w:val="StringTok"/>
-        </w:rPr>
-        <w:t xml:space="preserve">"ggeffects"</w:t>
-      </w:r>
-      <w:r>
-        <w:rPr>
-          <w:rStyle w:val="NormalTok"/>
-        </w:rPr>
-        <w:t xml:space="preserve">)</w:t>
-      </w:r>
-    </w:p>
-    <w:p>
-      <w:pPr>
-        <w:pStyle w:val="FirstParagraph"/>
-      </w:pPr>
-      <w:r>
-        <w:t xml:space="preserve">As with other</w:t>
-      </w:r>
-      <w:r>
-        <w:t xml:space="preserve"> </w:t>
-      </w:r>
-      <w:r>
-        <w:rPr>
-          <w:rStyle w:val="VerbatimChar"/>
-        </w:rPr>
-        <w:t xml:space="preserve">R</w:t>
-      </w:r>
-      <w:r>
-        <w:t xml:space="preserve"> </w:t>
-      </w:r>
-      <w:r>
-        <w:t xml:space="preserve">packages, once it’s installed on your machine you shouldn’t need to install it again. When it’s finished loading, make sure to load it:</w:t>
-      </w:r>
-    </w:p>
-    <w:p>
-      <w:pPr>
-        <w:pStyle w:val="SourceCode"/>
-      </w:pPr>
-      <w:r>
-        <w:rPr>
-          <w:rStyle w:val="FunctionTok"/>
-        </w:rPr>
-        <w:t xml:space="preserve">library</w:t>
-      </w:r>
-      <w:r>
-        <w:rPr>
-          <w:rStyle w:val="NormalTok"/>
-        </w:rPr>
-        <w:t xml:space="preserve">(ggeffects)</w:t>
-      </w:r>
-    </w:p>
-    <w:p>
-      <w:pPr>
-        <w:pStyle w:val="FirstParagraph"/>
-      </w:pPr>
-      <w:r>
-        <w:t xml:space="preserve">Next, we’re going to use a function within</w:t>
-      </w:r>
-      <w:r>
-        <w:t xml:space="preserve"> </w:t>
-      </w:r>
-      <w:r>
-        <w:rPr>
-          <w:rStyle w:val="VerbatimChar"/>
-        </w:rPr>
-        <w:t xml:space="preserve">ggeffects</w:t>
-      </w:r>
-      <w:r>
-        <w:t xml:space="preserve"> </w:t>
-      </w:r>
-      <w:r>
-        <w:t xml:space="preserve">to create predictions from our model which we’ll store in a new object called</w:t>
-      </w:r>
-      <w:r>
-        <w:t xml:space="preserve"> </w:t>
-      </w:r>
-      <w:r>
-        <w:rPr>
-          <w:rStyle w:val="VerbatimChar"/>
-        </w:rPr>
-        <w:t xml:space="preserve">preds</w:t>
-      </w:r>
-      <w:r>
-        <w:t xml:space="preserve"> </w:t>
-      </w:r>
-      <w:r>
-        <w:t xml:space="preserve">(or whatever you prefer to call it), which we’ll plot subsequently. This is where storing the model output becomes really handy:</w:t>
-      </w:r>
-    </w:p>
-    <w:p>
-      <w:pPr>
-        <w:pStyle w:val="SourceCode"/>
-      </w:pPr>
-      <w:r>
-        <w:rPr>
-          <w:rStyle w:val="NormalTok"/>
-        </w:rPr>
-        <w:t xml:space="preserve">preds </w:t>
-      </w:r>
-      <w:r>
-        <w:rPr>
-          <w:rStyle w:val="OtherTok"/>
-        </w:rPr>
-        <w:t xml:space="preserve">&lt;-</w:t>
-      </w:r>
-      <w:r>
-        <w:rPr>
-          <w:rStyle w:val="NormalTok"/>
-        </w:rPr>
-        <w:t xml:space="preserve"> </w:t>
-      </w:r>
-      <w:r>
-        <w:rPr>
-          <w:rStyle w:val="FunctionTok"/>
-        </w:rPr>
-        <w:t xml:space="preserve">ggpredict</w:t>
-      </w:r>
-      <w:r>
-        <w:rPr>
-          <w:rStyle w:val="NormalTok"/>
-        </w:rPr>
-        <w:t xml:space="preserve">(boto_model)</w:t>
-      </w:r>
-    </w:p>
-    <w:p>
-      <w:pPr>
-        <w:pStyle w:val="FirstParagraph"/>
-      </w:pPr>
-      <w:r>
-        <w:t xml:space="preserve">Now we just need to plot it:</w:t>
-      </w:r>
-    </w:p>
-    <w:p>
-      <w:pPr>
-        <w:pStyle w:val="SourceCode"/>
-      </w:pPr>
-      <w:r>
-        <w:rPr>
-          <w:rStyle w:val="FunctionTok"/>
-        </w:rPr>
-        <w:t xml:space="preserve">plot</w:t>
-      </w:r>
-      <w:r>
-        <w:rPr>
-          <w:rStyle w:val="NormalTok"/>
-        </w:rPr>
-        <w:t xml:space="preserve">(preds)</w:t>
-      </w:r>
-    </w:p>
-    <w:p>
-      <w:pPr>
-        <w:pStyle w:val="FirstParagraph"/>
       </w:pPr>
       <w:r>
         <w:drawing>
@@ -4278,7 +3989,7 @@
               <a:graphicData uri="http://schemas.openxmlformats.org/drawingml/2006/picture">
                 <pic:pic>
                   <pic:nvPicPr>
-                    <pic:cNvPr descr="Workshop-3---LM-with-a-continuous-predictor--with-answers-_files/figure-docx/unnamed-chunk-19-1.png" id="38" name="Picture"/>
+                    <pic:cNvPr descr="Workshop-3---LM-with-a-continuous-predictor--with-answers-_files/figure-docx/unnamed-chunk-16-1.png" id="38" name="Picture"/>
                     <pic:cNvPicPr>
                       <a:picLocks noChangeArrowheads="1" noChangeAspect="1"/>
                     </pic:cNvPicPr>
@@ -4316,729 +4027,324 @@
         <w:pStyle w:val="BodyText"/>
       </w:pPr>
       <w:r>
-        <w:t xml:space="preserve">And there we have it - with 95% confidence thrown in as a bonus! (We’ll cover 95% CI and what they mean next week). As easy as that. Buuuuut…. there are stylistic choices that I, personally and subjectively, don’t like. I wanna decide what’s going on, not some automated software!</w:t>
-      </w:r>
-    </w:p>
-    <w:bookmarkEnd w:id="39"/>
-    <w:bookmarkStart w:id="43" w:name="X7edb65d87e4270dc90baec660bef0aa39b5f258"/>
-    <w:p>
-      <w:pPr>
-        <w:pStyle w:val="Heading2"/>
-      </w:pPr>
-      <w:r>
-        <w:t xml:space="preserve">Create the prediction and figure yourself.</w:t>
-      </w:r>
-    </w:p>
-    <w:p>
-      <w:pPr>
-        <w:pStyle w:val="FirstParagraph"/>
-      </w:pPr>
-      <w:r>
-        <w:t xml:space="preserve">It’s actually not much harder to make the figure ourselves. We’ve actually already learnt all of the techniques we need to do so. Let’s get to it.</w:t>
+        <w:t xml:space="preserve">In the figure above, the parameter estimates from the model (</w:t>
+      </w:r>
+      <m:oMath>
+        <m:sSub>
+          <m:e>
+            <m:r>
+              <m:t>β</m:t>
+            </m:r>
+          </m:e>
+          <m:sub>
+            <m:r>
+              <m:t>0</m:t>
+            </m:r>
+          </m:sub>
+        </m:sSub>
+        <m:d>
+          <m:dPr>
+            <m:begChr m:val="("/>
+            <m:endChr m:val=")"/>
+            <m:sepChr m:val=""/>
+            <m:grow/>
+          </m:dPr>
+          <m:e>
+            <m:r>
+              <m:rPr>
+                <m:nor/>
+                <m:sty m:val="p"/>
+              </m:rPr>
+              <m:t>Intercept</m:t>
+            </m:r>
+          </m:e>
+        </m:d>
+        <m:r>
+          <m:rPr>
+            <m:sty m:val="p"/>
+          </m:rPr>
+          <m:t>=</m:t>
+        </m:r>
+        <m:r>
+          <m:rPr>
+            <m:sty m:val="p"/>
+          </m:rPr>
+          <m:t>−</m:t>
+        </m:r>
+        <m:r>
+          <m:t>1.23456789</m:t>
+        </m:r>
+      </m:oMath>
+      <w:r>
+        <w:t xml:space="preserve"> </w:t>
+      </w:r>
+      <w:r>
+        <w:t xml:space="preserve">and</w:t>
+      </w:r>
+      <w:r>
+        <w:t xml:space="preserve"> </w:t>
+      </w:r>
+      <m:oMath>
+        <m:sSub>
+          <m:e>
+            <m:r>
+              <m:t>β</m:t>
+            </m:r>
+          </m:e>
+          <m:sub>
+            <m:r>
+              <m:t>1</m:t>
+            </m:r>
+          </m:sub>
+        </m:sSub>
+        <m:d>
+          <m:dPr>
+            <m:begChr m:val="("/>
+            <m:endChr m:val=")"/>
+            <m:sepChr m:val=""/>
+            <m:grow/>
+          </m:dPr>
+          <m:e>
+            <m:r>
+              <m:rPr>
+                <m:nor/>
+                <m:sty m:val="p"/>
+              </m:rPr>
+              <m:t>Slope</m:t>
+            </m:r>
+          </m:e>
+        </m:d>
+        <m:r>
+          <m:rPr>
+            <m:sty m:val="p"/>
+          </m:rPr>
+          <m:t>=</m:t>
+        </m:r>
+        <m:r>
+          <m:t>3.45567891</m:t>
+        </m:r>
+      </m:oMath>
+      <w:r>
+        <w:t xml:space="preserve">) have been rounded to zero or two decimal places. For zero decimal places, this becomes (</w:t>
+      </w:r>
+      <m:oMath>
+        <m:sSub>
+          <m:e>
+            <m:r>
+              <m:t>β</m:t>
+            </m:r>
+          </m:e>
+          <m:sub>
+            <m:r>
+              <m:t>0</m:t>
+            </m:r>
+          </m:sub>
+        </m:sSub>
+        <m:d>
+          <m:dPr>
+            <m:begChr m:val="("/>
+            <m:endChr m:val=")"/>
+            <m:sepChr m:val=""/>
+            <m:grow/>
+          </m:dPr>
+          <m:e>
+            <m:r>
+              <m:rPr>
+                <m:nor/>
+                <m:sty m:val="p"/>
+              </m:rPr>
+              <m:t>Intercept</m:t>
+            </m:r>
+          </m:e>
+        </m:d>
+        <m:r>
+          <m:rPr>
+            <m:sty m:val="p"/>
+          </m:rPr>
+          <m:t>=</m:t>
+        </m:r>
+        <m:r>
+          <m:rPr>
+            <m:sty m:val="p"/>
+          </m:rPr>
+          <m:t>−</m:t>
+        </m:r>
+        <m:r>
+          <m:t>1</m:t>
+        </m:r>
+      </m:oMath>
+      <w:r>
+        <w:t xml:space="preserve"> </w:t>
+      </w:r>
+      <w:r>
+        <w:t xml:space="preserve">and</w:t>
+      </w:r>
+      <w:r>
+        <w:t xml:space="preserve"> </w:t>
+      </w:r>
+      <m:oMath>
+        <m:sSub>
+          <m:e>
+            <m:r>
+              <m:t>β</m:t>
+            </m:r>
+          </m:e>
+          <m:sub>
+            <m:r>
+              <m:t>1</m:t>
+            </m:r>
+          </m:sub>
+        </m:sSub>
+        <m:d>
+          <m:dPr>
+            <m:begChr m:val="("/>
+            <m:endChr m:val=")"/>
+            <m:sepChr m:val=""/>
+            <m:grow/>
+          </m:dPr>
+          <m:e>
+            <m:r>
+              <m:rPr>
+                <m:nor/>
+                <m:sty m:val="p"/>
+              </m:rPr>
+              <m:t>Slope</m:t>
+            </m:r>
+          </m:e>
+        </m:d>
+        <m:r>
+          <m:rPr>
+            <m:sty m:val="p"/>
+          </m:rPr>
+          <m:t>=</m:t>
+        </m:r>
+        <m:r>
+          <m:t>3</m:t>
+        </m:r>
+      </m:oMath>
+      <w:r>
+        <w:t xml:space="preserve">) and for twop decimal places (</w:t>
+      </w:r>
+      <m:oMath>
+        <m:sSub>
+          <m:e>
+            <m:r>
+              <m:t>β</m:t>
+            </m:r>
+          </m:e>
+          <m:sub>
+            <m:r>
+              <m:t>0</m:t>
+            </m:r>
+          </m:sub>
+        </m:sSub>
+        <m:d>
+          <m:dPr>
+            <m:begChr m:val="("/>
+            <m:endChr m:val=")"/>
+            <m:sepChr m:val=""/>
+            <m:grow/>
+          </m:dPr>
+          <m:e>
+            <m:r>
+              <m:rPr>
+                <m:nor/>
+                <m:sty m:val="p"/>
+              </m:rPr>
+              <m:t>Intercept</m:t>
+            </m:r>
+          </m:e>
+        </m:d>
+        <m:r>
+          <m:rPr>
+            <m:sty m:val="p"/>
+          </m:rPr>
+          <m:t>=</m:t>
+        </m:r>
+        <m:r>
+          <m:rPr>
+            <m:sty m:val="p"/>
+          </m:rPr>
+          <m:t>−</m:t>
+        </m:r>
+        <m:r>
+          <m:t>1.23</m:t>
+        </m:r>
+      </m:oMath>
+      <w:r>
+        <w:t xml:space="preserve"> </w:t>
+      </w:r>
+      <w:r>
+        <w:t xml:space="preserve">and</w:t>
+      </w:r>
+      <w:r>
+        <w:t xml:space="preserve"> </w:t>
+      </w:r>
+      <m:oMath>
+        <m:sSub>
+          <m:e>
+            <m:r>
+              <m:t>β</m:t>
+            </m:r>
+          </m:e>
+          <m:sub>
+            <m:r>
+              <m:t>1</m:t>
+            </m:r>
+          </m:sub>
+        </m:sSub>
+        <m:d>
+          <m:dPr>
+            <m:begChr m:val="("/>
+            <m:endChr m:val=")"/>
+            <m:sepChr m:val=""/>
+            <m:grow/>
+          </m:dPr>
+          <m:e>
+            <m:r>
+              <m:rPr>
+                <m:nor/>
+                <m:sty m:val="p"/>
+              </m:rPr>
+              <m:t>Slope</m:t>
+            </m:r>
+          </m:e>
+        </m:d>
+        <m:r>
+          <m:rPr>
+            <m:sty m:val="p"/>
+          </m:rPr>
+          <m:t>=</m:t>
+        </m:r>
+        <m:r>
+          <m:t>3.46</m:t>
+        </m:r>
+      </m:oMath>
+      <w:r>
+        <w:t xml:space="preserve">), resulting in fairly different lines being drawn here. This isn’t great, because an arbitrary decision is having an impact in how we understand the system. We can see a more extreme (but not uncommon) example below.</w:t>
       </w:r>
     </w:p>
     <w:p>
       <w:pPr>
         <w:pStyle w:val="BodyText"/>
-      </w:pPr>
-      <w:r>
-        <w:t xml:space="preserve">For starters, we’re going to make a</w:t>
-      </w:r>
-      <w:r>
-        <w:t xml:space="preserve"> </w:t>
-      </w:r>
-      <w:r>
-        <w:rPr>
-          <w:iCs/>
-          <w:i/>
-        </w:rPr>
-        <w:t xml:space="preserve">fake</w:t>
-      </w:r>
-      <w:r>
-        <w:t xml:space="preserve"> </w:t>
-      </w:r>
-      <w:r>
-        <w:t xml:space="preserve">dataset. This dataset is going to contain, initially, just one variable;</w:t>
-      </w:r>
-      <w:r>
-        <w:t xml:space="preserve"> </w:t>
-      </w:r>
-      <w:r>
-        <w:rPr>
-          <w:rStyle w:val="VerbatimChar"/>
-        </w:rPr>
-        <w:t xml:space="preserve">drought</w:t>
-      </w:r>
-      <w:r>
-        <w:t xml:space="preserve">, and we’re going to keep it as simple as we can. We just want drought values of 0, 1, 2, 3, 4, 5, 6, 7 and 8. We can create this kind of data super easily in</w:t>
-      </w:r>
-      <w:r>
-        <w:t xml:space="preserve"> </w:t>
-      </w:r>
-      <w:r>
-        <w:rPr>
-          <w:rStyle w:val="VerbatimChar"/>
-        </w:rPr>
-        <w:t xml:space="preserve">R</w:t>
-      </w:r>
-      <w:r>
-        <w:t xml:space="preserve"> </w:t>
-      </w:r>
-      <w:r>
-        <w:t xml:space="preserve">using</w:t>
-      </w:r>
-      <w:r>
-        <w:t xml:space="preserve"> </w:t>
-      </w:r>
-      <w:r>
-        <w:rPr>
-          <w:rStyle w:val="VerbatimChar"/>
-        </w:rPr>
-        <w:t xml:space="preserve">0:8</w:t>
-      </w:r>
-      <w:r>
-        <w:t xml:space="preserve">. Try entering</w:t>
-      </w:r>
-      <w:r>
-        <w:t xml:space="preserve"> </w:t>
-      </w:r>
-      <w:r>
-        <w:rPr>
-          <w:rStyle w:val="VerbatimChar"/>
-        </w:rPr>
-        <w:t xml:space="preserve">0:8</w:t>
-      </w:r>
-      <w:r>
-        <w:t xml:space="preserve"> </w:t>
-      </w:r>
-      <w:r>
-        <w:t xml:space="preserve">in the console to see what it does, if you’re unsure. To create the</w:t>
-      </w:r>
-      <w:r>
-        <w:t xml:space="preserve"> </w:t>
-      </w:r>
-      <w:r>
-        <w:rPr>
-          <w:rStyle w:val="VerbatimChar"/>
-        </w:rPr>
-        <w:t xml:space="preserve">fake</w:t>
-      </w:r>
-      <w:r>
-        <w:t xml:space="preserve"> </w:t>
-      </w:r>
-      <w:r>
-        <w:t xml:space="preserve">dataset we use the</w:t>
-      </w:r>
-      <w:r>
-        <w:t xml:space="preserve"> </w:t>
-      </w:r>
-      <w:r>
-        <w:rPr>
-          <w:rStyle w:val="VerbatimChar"/>
-        </w:rPr>
-        <w:t xml:space="preserve">data.frame()</w:t>
-      </w:r>
-      <w:r>
-        <w:t xml:space="preserve"> </w:t>
-      </w:r>
-      <w:r>
-        <w:t xml:space="preserve">function. Bringing this all together, we get:</w:t>
-      </w:r>
-    </w:p>
-    <w:p>
-      <w:pPr>
-        <w:pStyle w:val="SourceCode"/>
-      </w:pPr>
-      <w:r>
-        <w:rPr>
-          <w:rStyle w:val="NormalTok"/>
-        </w:rPr>
-        <w:t xml:space="preserve">fake </w:t>
-      </w:r>
-      <w:r>
-        <w:rPr>
-          <w:rStyle w:val="OtherTok"/>
-        </w:rPr>
-        <w:t xml:space="preserve">&lt;-</w:t>
-      </w:r>
-      <w:r>
-        <w:rPr>
-          <w:rStyle w:val="NormalTok"/>
-        </w:rPr>
-        <w:t xml:space="preserve"> </w:t>
-      </w:r>
-      <w:r>
-        <w:rPr>
-          <w:rStyle w:val="FunctionTok"/>
-        </w:rPr>
-        <w:t xml:space="preserve">data.frame</w:t>
-      </w:r>
-      <w:r>
-        <w:rPr>
-          <w:rStyle w:val="NormalTok"/>
-        </w:rPr>
-        <w:t xml:space="preserve">(</w:t>
-      </w:r>
-      <w:r>
-        <w:br/>
-      </w:r>
-      <w:r>
-        <w:rPr>
-          <w:rStyle w:val="NormalTok"/>
-        </w:rPr>
-        <w:t xml:space="preserve">  </w:t>
-      </w:r>
-      <w:r>
-        <w:rPr>
-          <w:rStyle w:val="AttributeTok"/>
-        </w:rPr>
-        <w:t xml:space="preserve">drought =</w:t>
-      </w:r>
-      <w:r>
-        <w:rPr>
-          <w:rStyle w:val="NormalTok"/>
-        </w:rPr>
-        <w:t xml:space="preserve"> </w:t>
-      </w:r>
-      <w:r>
-        <w:rPr>
-          <w:rStyle w:val="DecValTok"/>
-        </w:rPr>
-        <w:t xml:space="preserve">0</w:t>
-      </w:r>
-      <w:r>
-        <w:rPr>
-          <w:rStyle w:val="SpecialCharTok"/>
-        </w:rPr>
-        <w:t xml:space="preserve">:</w:t>
-      </w:r>
-      <w:r>
-        <w:rPr>
-          <w:rStyle w:val="DecValTok"/>
-        </w:rPr>
-        <w:t xml:space="preserve">8</w:t>
-      </w:r>
-      <w:r>
-        <w:br/>
-      </w:r>
-      <w:r>
-        <w:rPr>
-          <w:rStyle w:val="NormalTok"/>
-        </w:rPr>
-        <w:t xml:space="preserve">)</w:t>
-      </w:r>
-    </w:p>
-    <w:p>
-      <w:pPr>
-        <w:pStyle w:val="FirstParagraph"/>
-      </w:pPr>
-      <w:r>
-        <w:t xml:space="preserve">In Question Set Three, you specified values of drought and used your equation to predict boto length by hand. What we’re going to do next is</w:t>
-      </w:r>
-      <w:r>
-        <w:t xml:space="preserve"> </w:t>
-      </w:r>
-      <w:r>
-        <w:rPr>
-          <w:iCs/>
-          <w:i/>
-        </w:rPr>
-        <w:t xml:space="preserve">exactly</w:t>
-      </w:r>
-      <w:r>
-        <w:t xml:space="preserve"> </w:t>
-      </w:r>
-      <w:r>
-        <w:t xml:space="preserve">the same, we’re just going to be</w:t>
-      </w:r>
-      <w:r>
-        <w:t xml:space="preserve"> </w:t>
-      </w:r>
-      <w:r>
-        <w:t xml:space="preserve">“</w:t>
-      </w:r>
-      <w:r>
-        <w:t xml:space="preserve">lazy</w:t>
-      </w:r>
-      <w:r>
-        <w:t xml:space="preserve">”</w:t>
-      </w:r>
-      <w:r>
-        <w:t xml:space="preserve"> </w:t>
-      </w:r>
-      <w:r>
-        <w:t xml:space="preserve">and have</w:t>
-      </w:r>
-      <w:r>
-        <w:t xml:space="preserve"> </w:t>
-      </w:r>
-      <w:r>
-        <w:rPr>
-          <w:rStyle w:val="VerbatimChar"/>
-        </w:rPr>
-        <w:t xml:space="preserve">R</w:t>
-      </w:r>
-      <w:r>
-        <w:t xml:space="preserve"> </w:t>
-      </w:r>
-      <w:r>
-        <w:t xml:space="preserve">do it for us using the</w:t>
-      </w:r>
-      <w:r>
-        <w:t xml:space="preserve"> </w:t>
-      </w:r>
-      <w:r>
-        <w:rPr>
-          <w:rStyle w:val="VerbatimChar"/>
-        </w:rPr>
-        <w:t xml:space="preserve">predict()</w:t>
-      </w:r>
-      <w:r>
-        <w:t xml:space="preserve"> </w:t>
-      </w:r>
-      <w:r>
-        <w:t xml:space="preserve">function. To be clear, it’s doing</w:t>
-      </w:r>
-      <w:r>
-        <w:t xml:space="preserve"> </w:t>
-      </w:r>
-      <w:r>
-        <w:rPr>
-          <w:iCs/>
-          <w:i/>
-        </w:rPr>
-        <w:t xml:space="preserve">exactly</w:t>
-      </w:r>
-      <w:r>
-        <w:t xml:space="preserve"> </w:t>
-      </w:r>
-      <w:r>
-        <w:t xml:space="preserve">the same thing you did; just taking a value of drought and predicting boto length. As with</w:t>
-      </w:r>
-      <w:r>
-        <w:t xml:space="preserve"> </w:t>
-      </w:r>
-      <w:r>
-        <w:rPr>
-          <w:rStyle w:val="VerbatimChar"/>
-        </w:rPr>
-        <w:t xml:space="preserve">ggeffects</w:t>
-      </w:r>
-      <w:r>
-        <w:t xml:space="preserve"> </w:t>
-      </w:r>
-      <w:r>
-        <w:t xml:space="preserve">we say what the model was, but we’re also going to tell</w:t>
-      </w:r>
-      <w:r>
-        <w:t xml:space="preserve"> </w:t>
-      </w:r>
-      <w:r>
-        <w:rPr>
-          <w:rStyle w:val="VerbatimChar"/>
-        </w:rPr>
-        <w:t xml:space="preserve">predict()</w:t>
-      </w:r>
-      <w:r>
-        <w:t xml:space="preserve"> </w:t>
-      </w:r>
-      <w:r>
-        <w:t xml:space="preserve">to use a new dataset to make the predictions; our</w:t>
-      </w:r>
-      <w:r>
-        <w:t xml:space="preserve"> </w:t>
-      </w:r>
-      <w:r>
-        <w:rPr>
-          <w:rStyle w:val="VerbatimChar"/>
-        </w:rPr>
-        <w:t xml:space="preserve">fake</w:t>
-      </w:r>
-      <w:r>
-        <w:t xml:space="preserve"> </w:t>
-      </w:r>
-      <w:r>
-        <w:t xml:space="preserve">dataset. We’re then going to add these predictions into the</w:t>
-      </w:r>
-      <w:r>
-        <w:t xml:space="preserve"> </w:t>
-      </w:r>
-      <w:r>
-        <w:rPr>
-          <w:rStyle w:val="VerbatimChar"/>
-        </w:rPr>
-        <w:t xml:space="preserve">fake</w:t>
-      </w:r>
-      <w:r>
-        <w:t xml:space="preserve"> </w:t>
-      </w:r>
-      <w:r>
-        <w:t xml:space="preserve">dataset to make plotting easier for us.</w:t>
-      </w:r>
-    </w:p>
-    <w:p>
-      <w:pPr>
-        <w:pStyle w:val="SourceCode"/>
-      </w:pPr>
-      <w:r>
-        <w:rPr>
-          <w:rStyle w:val="NormalTok"/>
-        </w:rPr>
-        <w:t xml:space="preserve">fake</w:t>
-      </w:r>
-      <w:r>
-        <w:rPr>
-          <w:rStyle w:val="SpecialCharTok"/>
-        </w:rPr>
-        <w:t xml:space="preserve">$</w:t>
-      </w:r>
-      <w:r>
-        <w:rPr>
-          <w:rStyle w:val="NormalTok"/>
-        </w:rPr>
-        <w:t xml:space="preserve">fit </w:t>
-      </w:r>
-      <w:r>
-        <w:rPr>
-          <w:rStyle w:val="OtherTok"/>
-        </w:rPr>
-        <w:t xml:space="preserve">&lt;-</w:t>
-      </w:r>
-      <w:r>
-        <w:rPr>
-          <w:rStyle w:val="NormalTok"/>
-        </w:rPr>
-        <w:t xml:space="preserve"> </w:t>
-      </w:r>
-      <w:r>
-        <w:rPr>
-          <w:rStyle w:val="FunctionTok"/>
-        </w:rPr>
-        <w:t xml:space="preserve">predict</w:t>
-      </w:r>
-      <w:r>
-        <w:rPr>
-          <w:rStyle w:val="NormalTok"/>
-        </w:rPr>
-        <w:t xml:space="preserve">(boto_model, </w:t>
-      </w:r>
-      <w:r>
-        <w:rPr>
-          <w:rStyle w:val="AttributeTok"/>
-        </w:rPr>
-        <w:t xml:space="preserve">newdata =</w:t>
-      </w:r>
-      <w:r>
-        <w:rPr>
-          <w:rStyle w:val="NormalTok"/>
-        </w:rPr>
-        <w:t xml:space="preserve"> fake)</w:t>
-      </w:r>
-    </w:p>
-    <w:p>
-      <w:pPr>
-        <w:pStyle w:val="FirstParagraph"/>
-      </w:pPr>
-      <w:r>
-        <w:t xml:space="preserve">Now we have a dataset that contains all values of</w:t>
-      </w:r>
-      <w:r>
-        <w:t xml:space="preserve"> </w:t>
-      </w:r>
-      <w:r>
-        <w:rPr>
-          <w:rStyle w:val="VerbatimChar"/>
-        </w:rPr>
-        <w:t xml:space="preserve">drought</w:t>
-      </w:r>
-      <w:r>
-        <w:t xml:space="preserve"> </w:t>
-      </w:r>
-      <w:r>
-        <w:t xml:space="preserve">we’re interested in, as well as the predicted length (called</w:t>
-      </w:r>
-      <w:r>
-        <w:t xml:space="preserve"> </w:t>
-      </w:r>
-      <w:r>
-        <w:rPr>
-          <w:rStyle w:val="VerbatimChar"/>
-        </w:rPr>
-        <w:t xml:space="preserve">fit</w:t>
-      </w:r>
-      <w:r>
-        <w:t xml:space="preserve"> </w:t>
-      </w:r>
-      <w:r>
-        <w:t xml:space="preserve">in my code above). So we have a dataset (</w:t>
-      </w:r>
-      <w:r>
-        <w:rPr>
-          <w:rStyle w:val="VerbatimChar"/>
-        </w:rPr>
-        <w:t xml:space="preserve">fake</w:t>
-      </w:r>
-      <w:r>
-        <w:t xml:space="preserve">) and we want to make a plot. You guys know how to do this, using</w:t>
-      </w:r>
-      <w:r>
-        <w:t xml:space="preserve"> </w:t>
-      </w:r>
-      <w:r>
-        <w:rPr>
-          <w:rStyle w:val="VerbatimChar"/>
-        </w:rPr>
-        <w:t xml:space="preserve">ggplot2</w:t>
-      </w:r>
-      <w:r>
-        <w:t xml:space="preserve">!</w:t>
-      </w:r>
-    </w:p>
-    <w:p>
-      <w:pPr>
-        <w:pStyle w:val="SourceCode"/>
-      </w:pPr>
-      <w:r>
-        <w:rPr>
-          <w:rStyle w:val="FunctionTok"/>
-        </w:rPr>
-        <w:t xml:space="preserve">ggplot</w:t>
-      </w:r>
-      <w:r>
-        <w:rPr>
-          <w:rStyle w:val="NormalTok"/>
-        </w:rPr>
-        <w:t xml:space="preserve">(fake) </w:t>
-      </w:r>
-      <w:r>
-        <w:rPr>
-          <w:rStyle w:val="SpecialCharTok"/>
-        </w:rPr>
-        <w:t xml:space="preserve">+</w:t>
-      </w:r>
-      <w:r>
-        <w:br/>
-      </w:r>
-      <w:r>
-        <w:rPr>
-          <w:rStyle w:val="NormalTok"/>
-        </w:rPr>
-        <w:t xml:space="preserve">  </w:t>
-      </w:r>
-      <w:r>
-        <w:rPr>
-          <w:rStyle w:val="FunctionTok"/>
-        </w:rPr>
-        <w:t xml:space="preserve">geom_line</w:t>
-      </w:r>
-      <w:r>
-        <w:rPr>
-          <w:rStyle w:val="NormalTok"/>
-        </w:rPr>
-        <w:t xml:space="preserve">(</w:t>
-      </w:r>
-      <w:r>
-        <w:rPr>
-          <w:rStyle w:val="FunctionTok"/>
-        </w:rPr>
-        <w:t xml:space="preserve">aes</w:t>
-      </w:r>
-      <w:r>
-        <w:rPr>
-          <w:rStyle w:val="NormalTok"/>
-        </w:rPr>
-        <w:t xml:space="preserve">(</w:t>
-      </w:r>
-      <w:r>
-        <w:rPr>
-          <w:rStyle w:val="AttributeTok"/>
-        </w:rPr>
-        <w:t xml:space="preserve">x =</w:t>
-      </w:r>
-      <w:r>
-        <w:rPr>
-          <w:rStyle w:val="NormalTok"/>
-        </w:rPr>
-        <w:t xml:space="preserve"> drought, </w:t>
-      </w:r>
-      <w:r>
-        <w:rPr>
-          <w:rStyle w:val="AttributeTok"/>
-        </w:rPr>
-        <w:t xml:space="preserve">y =</w:t>
-      </w:r>
-      <w:r>
-        <w:rPr>
-          <w:rStyle w:val="NormalTok"/>
-        </w:rPr>
-        <w:t xml:space="preserve"> fit)) </w:t>
-      </w:r>
-      <w:r>
-        <w:rPr>
-          <w:rStyle w:val="SpecialCharTok"/>
-        </w:rPr>
-        <w:t xml:space="preserve">+</w:t>
-      </w:r>
-      <w:r>
-        <w:br/>
-      </w:r>
-      <w:r>
-        <w:rPr>
-          <w:rStyle w:val="NormalTok"/>
-        </w:rPr>
-        <w:t xml:space="preserve">  </w:t>
-      </w:r>
-      <w:r>
-        <w:rPr>
-          <w:rStyle w:val="FunctionTok"/>
-        </w:rPr>
-        <w:t xml:space="preserve">labs</w:t>
-      </w:r>
-      <w:r>
-        <w:rPr>
-          <w:rStyle w:val="NormalTok"/>
-        </w:rPr>
-        <w:t xml:space="preserve">(</w:t>
-      </w:r>
-      <w:r>
-        <w:rPr>
-          <w:rStyle w:val="AttributeTok"/>
-        </w:rPr>
-        <w:t xml:space="preserve">x =</w:t>
-      </w:r>
-      <w:r>
-        <w:rPr>
-          <w:rStyle w:val="NormalTok"/>
-        </w:rPr>
-        <w:t xml:space="preserve"> </w:t>
-      </w:r>
-      <w:r>
-        <w:rPr>
-          <w:rStyle w:val="StringTok"/>
-        </w:rPr>
-        <w:t xml:space="preserve">"Number of drought years"</w:t>
-      </w:r>
-      <w:r>
-        <w:rPr>
-          <w:rStyle w:val="NormalTok"/>
-        </w:rPr>
-        <w:t xml:space="preserve">,</w:t>
-      </w:r>
-      <w:r>
-        <w:br/>
-      </w:r>
-      <w:r>
-        <w:rPr>
-          <w:rStyle w:val="NormalTok"/>
-        </w:rPr>
-        <w:t xml:space="preserve">       </w:t>
-      </w:r>
-      <w:r>
-        <w:rPr>
-          <w:rStyle w:val="AttributeTok"/>
-        </w:rPr>
-        <w:t xml:space="preserve">y =</w:t>
-      </w:r>
-      <w:r>
-        <w:rPr>
-          <w:rStyle w:val="NormalTok"/>
-        </w:rPr>
-        <w:t xml:space="preserve"> </w:t>
-      </w:r>
-      <w:r>
-        <w:rPr>
-          <w:rStyle w:val="StringTok"/>
-        </w:rPr>
-        <w:t xml:space="preserve">"Predicted length of boto (cm)"</w:t>
-      </w:r>
-      <w:r>
-        <w:rPr>
-          <w:rStyle w:val="NormalTok"/>
-        </w:rPr>
-        <w:t xml:space="preserve">,</w:t>
-      </w:r>
-      <w:r>
-        <w:br/>
-      </w:r>
-      <w:r>
-        <w:rPr>
-          <w:rStyle w:val="NormalTok"/>
-        </w:rPr>
-        <w:t xml:space="preserve">       </w:t>
-      </w:r>
-      <w:r>
-        <w:rPr>
-          <w:rStyle w:val="AttributeTok"/>
-        </w:rPr>
-        <w:t xml:space="preserve">title =</w:t>
-      </w:r>
-      <w:r>
-        <w:rPr>
-          <w:rStyle w:val="NormalTok"/>
-        </w:rPr>
-        <w:t xml:space="preserve"> </w:t>
-      </w:r>
-      <w:r>
-        <w:rPr>
-          <w:rStyle w:val="StringTok"/>
-        </w:rPr>
-        <w:t xml:space="preserve">"Estimated association between boto length and drought"</w:t>
-      </w:r>
-      <w:r>
-        <w:rPr>
-          <w:rStyle w:val="NormalTok"/>
-        </w:rPr>
-        <w:t xml:space="preserve">) </w:t>
-      </w:r>
-      <w:r>
-        <w:rPr>
-          <w:rStyle w:val="SpecialCharTok"/>
-        </w:rPr>
-        <w:t xml:space="preserve">+</w:t>
-      </w:r>
-      <w:r>
-        <w:br/>
-      </w:r>
-      <w:r>
-        <w:rPr>
-          <w:rStyle w:val="NormalTok"/>
-        </w:rPr>
-        <w:t xml:space="preserve">  </w:t>
-      </w:r>
-      <w:r>
-        <w:rPr>
-          <w:rStyle w:val="FunctionTok"/>
-        </w:rPr>
-        <w:t xml:space="preserve">theme_minimal</w:t>
-      </w:r>
-      <w:r>
-        <w:rPr>
-          <w:rStyle w:val="NormalTok"/>
-        </w:rPr>
-        <w:t xml:space="preserve">()</w:t>
-      </w:r>
-    </w:p>
-    <w:p>
-      <w:pPr>
-        <w:pStyle w:val="FirstParagraph"/>
       </w:pPr>
       <w:r>
         <w:drawing>
           <wp:inline>
             <wp:extent cx="4620126" cy="3696101"/>
             <wp:effectExtent b="0" l="0" r="0" t="0"/>
-            <wp:docPr descr="" title="" id="41" name="Picture"/>
+            <wp:docPr descr="" title="" id="40" name="Picture"/>
             <a:graphic>
               <a:graphicData uri="http://schemas.openxmlformats.org/drawingml/2006/picture">
                 <pic:pic>
                   <pic:nvPicPr>
-                    <pic:cNvPr descr="Workshop-3---LM-with-a-continuous-predictor--with-answers-_files/figure-docx/unnamed-chunk-22-1.png" id="42" name="Picture"/>
+                    <pic:cNvPr descr="Workshop-3---LM-with-a-continuous-predictor--with-answers-_files/figure-docx/unnamed-chunk-17-1.png" id="41" name="Picture"/>
                     <pic:cNvPicPr>
                       <a:picLocks noChangeArrowheads="1" noChangeAspect="1"/>
                     </pic:cNvPicPr>
                   </pic:nvPicPr>
                   <pic:blipFill>
-                    <a:blip r:embed="rId40"/>
+                    <a:blip r:embed="rId39"/>
                     <a:stretch>
                       <a:fillRect/>
                     </a:stretch>
@@ -5064,12 +4370,1384 @@
           </wp:inline>
         </w:drawing>
       </w:r>
+      <w:r>
+        <w:t xml:space="preserve"> </w:t>
+      </w:r>
+      <w:r>
+        <w:t xml:space="preserve">Note that in the above figure the explanatory variable values are much larger than the first example. Here we’re going up one million</w:t>
+      </w:r>
+      <w:r>
+        <w:t xml:space="preserve"> </w:t>
+      </w:r>
+      <w:r>
+        <w:t xml:space="preserve">“</w:t>
+      </w:r>
+      <w:r>
+        <w:t xml:space="preserve">explanatory variable units</w:t>
+      </w:r>
+      <w:r>
+        <w:t xml:space="preserve">”</w:t>
+      </w:r>
+      <w:r>
+        <w:t xml:space="preserve"> </w:t>
+      </w:r>
+      <w:r>
+        <w:t xml:space="preserve">(whatever this might be, e.g. CO2 emmissions), which means that our parameter estimates are, in this case, tiny;</w:t>
+      </w:r>
+      <w:r>
+        <w:t xml:space="preserve"> </w:t>
+      </w:r>
+      <m:oMath>
+        <m:sSub>
+          <m:e>
+            <m:r>
+              <m:t>β</m:t>
+            </m:r>
+          </m:e>
+          <m:sub>
+            <m:r>
+              <m:t>0</m:t>
+            </m:r>
+          </m:sub>
+        </m:sSub>
+        <m:d>
+          <m:dPr>
+            <m:begChr m:val="("/>
+            <m:endChr m:val=")"/>
+            <m:sepChr m:val=""/>
+            <m:grow/>
+          </m:dPr>
+          <m:e>
+            <m:r>
+              <m:rPr>
+                <m:nor/>
+                <m:sty m:val="p"/>
+              </m:rPr>
+              <m:t>Intercept</m:t>
+            </m:r>
+          </m:e>
+        </m:d>
+        <m:r>
+          <m:rPr>
+            <m:sty m:val="p"/>
+          </m:rPr>
+          <m:t>=</m:t>
+        </m:r>
+        <m:r>
+          <m:t>0.0000000652</m:t>
+        </m:r>
+      </m:oMath>
+      <w:r>
+        <w:t xml:space="preserve"> </w:t>
+      </w:r>
+      <w:r>
+        <w:t xml:space="preserve">and</w:t>
+      </w:r>
+      <w:r>
+        <w:t xml:space="preserve"> </w:t>
+      </w:r>
+      <m:oMath>
+        <m:sSub>
+          <m:e>
+            <m:r>
+              <m:t>β</m:t>
+            </m:r>
+          </m:e>
+          <m:sub>
+            <m:r>
+              <m:t>1</m:t>
+            </m:r>
+          </m:sub>
+        </m:sSub>
+        <m:d>
+          <m:dPr>
+            <m:begChr m:val="("/>
+            <m:endChr m:val=")"/>
+            <m:sepChr m:val=""/>
+            <m:grow/>
+          </m:dPr>
+          <m:e>
+            <m:r>
+              <m:rPr>
+                <m:nor/>
+                <m:sty m:val="p"/>
+              </m:rPr>
+              <m:t>Slope</m:t>
+            </m:r>
+          </m:e>
+        </m:d>
+        <m:r>
+          <m:rPr>
+            <m:sty m:val="p"/>
+          </m:rPr>
+          <m:t>=</m:t>
+        </m:r>
+        <m:r>
+          <m:t>0.0005161519</m:t>
+        </m:r>
+      </m:oMath>
+      <w:r>
+        <w:t xml:space="preserve">. Meaning that when we round these two two decimal places, we get</w:t>
+      </w:r>
+      <w:r>
+        <w:t xml:space="preserve"> </w:t>
+      </w:r>
+      <m:oMath>
+        <m:sSub>
+          <m:e>
+            <m:r>
+              <m:t>β</m:t>
+            </m:r>
+          </m:e>
+          <m:sub>
+            <m:r>
+              <m:t>0</m:t>
+            </m:r>
+          </m:sub>
+        </m:sSub>
+        <m:d>
+          <m:dPr>
+            <m:begChr m:val="("/>
+            <m:endChr m:val=")"/>
+            <m:sepChr m:val=""/>
+            <m:grow/>
+          </m:dPr>
+          <m:e>
+            <m:r>
+              <m:rPr>
+                <m:nor/>
+                <m:sty m:val="p"/>
+              </m:rPr>
+              <m:t>Intercept</m:t>
+            </m:r>
+          </m:e>
+        </m:d>
+        <m:r>
+          <m:rPr>
+            <m:sty m:val="p"/>
+          </m:rPr>
+          <m:t>=</m:t>
+        </m:r>
+        <m:r>
+          <m:t>0.00</m:t>
+        </m:r>
+      </m:oMath>
+      <w:r>
+        <w:t xml:space="preserve"> </w:t>
+      </w:r>
+      <w:r>
+        <w:t xml:space="preserve">and</w:t>
+      </w:r>
+      <w:r>
+        <w:t xml:space="preserve"> </w:t>
+      </w:r>
+      <m:oMath>
+        <m:sSub>
+          <m:e>
+            <m:r>
+              <m:t>β</m:t>
+            </m:r>
+          </m:e>
+          <m:sub>
+            <m:r>
+              <m:t>1</m:t>
+            </m:r>
+          </m:sub>
+        </m:sSub>
+        <m:d>
+          <m:dPr>
+            <m:begChr m:val="("/>
+            <m:endChr m:val=")"/>
+            <m:sepChr m:val=""/>
+            <m:grow/>
+          </m:dPr>
+          <m:e>
+            <m:r>
+              <m:rPr>
+                <m:nor/>
+                <m:sty m:val="p"/>
+              </m:rPr>
+              <m:t>Slope</m:t>
+            </m:r>
+          </m:e>
+        </m:d>
+        <m:r>
+          <m:rPr>
+            <m:sty m:val="p"/>
+          </m:rPr>
+          <m:t>=</m:t>
+        </m:r>
+        <m:r>
+          <m:t>0.00</m:t>
+        </m:r>
+      </m:oMath>
+      <w:r>
+        <w:t xml:space="preserve">.</w:t>
+      </w:r>
     </w:p>
     <w:p>
       <w:pPr>
         <w:pStyle w:val="BodyText"/>
       </w:pPr>
       <w:r>
+        <w:t xml:space="preserve">So in the first example, rounding to two decimal points is perfect. In the second, it’s terrible. The point here is that when you round numbers for a something like a report or thesis, then you need to think about it. How much does the number change if I round to zero decimal points? What about to five decimal points? What is the range of the explanatory variable? Does it go to billions, or just a handful? All of these are important features to consider, particularly when working with parameter estimates.</w:t>
+      </w:r>
+    </w:p>
+    <w:p>
+      <w:pPr>
+        <w:pStyle w:val="BlockText"/>
+      </w:pPr>
+      <w:r>
+        <w:t xml:space="preserve">In the tests for BI3010 we will always state how many decimal points you should report values to.</w:t>
+      </w:r>
+    </w:p>
+    <w:bookmarkEnd w:id="42"/>
+    <w:bookmarkStart w:id="51" w:name="summarise-the-results."/>
+    <w:p>
+      <w:pPr>
+        <w:pStyle w:val="Heading1"/>
+      </w:pPr>
+      <w:r>
+        <w:t xml:space="preserve">6. Summarise the results.</w:t>
+      </w:r>
+    </w:p>
+    <w:p>
+      <w:pPr>
+        <w:pStyle w:val="FirstParagraph"/>
+      </w:pPr>
+      <w:r>
+        <w:t xml:space="preserve">We’ll come back to</w:t>
+      </w:r>
+      <w:r>
+        <w:t xml:space="preserve"> </w:t>
+      </w:r>
+      <w:r>
+        <w:t xml:space="preserve">“</w:t>
+      </w:r>
+      <w:r>
+        <w:t xml:space="preserve">5. Diagnose the model and check assumptions.</w:t>
+      </w:r>
+      <w:r>
+        <w:t xml:space="preserve">”</w:t>
+      </w:r>
+      <w:r>
+        <w:t xml:space="preserve"> </w:t>
+      </w:r>
+      <w:r>
+        <w:t xml:space="preserve">on Friday. For today we’ll go through how to take these results and convert them into a figure.</w:t>
+      </w:r>
+    </w:p>
+    <w:p>
+      <w:pPr>
+        <w:pStyle w:val="BodyText"/>
+      </w:pPr>
+      <w:r>
+        <w:t xml:space="preserve">To do so we’ll show you two options.</w:t>
+      </w:r>
+    </w:p>
+    <w:p>
+      <w:pPr>
+        <w:numPr>
+          <w:ilvl w:val="0"/>
+          <w:numId w:val="1016"/>
+        </w:numPr>
+      </w:pPr>
+      <w:r>
+        <w:t xml:space="preserve">Option 1: Use an</w:t>
+      </w:r>
+      <w:r>
+        <w:t xml:space="preserve"> </w:t>
+      </w:r>
+      <w:r>
+        <w:rPr>
+          <w:rStyle w:val="VerbatimChar"/>
+        </w:rPr>
+        <w:t xml:space="preserve">R</w:t>
+      </w:r>
+      <w:r>
+        <w:t xml:space="preserve"> </w:t>
+      </w:r>
+      <w:r>
+        <w:t xml:space="preserve">package to create the figure for you.</w:t>
+      </w:r>
+    </w:p>
+    <w:p>
+      <w:pPr>
+        <w:numPr>
+          <w:ilvl w:val="0"/>
+          <w:numId w:val="1016"/>
+        </w:numPr>
+      </w:pPr>
+      <w:r>
+        <w:t xml:space="preserve">Option 2: Create the prediction and figure yourself.</w:t>
+      </w:r>
+    </w:p>
+    <w:p>
+      <w:pPr>
+        <w:pStyle w:val="FirstParagraph"/>
+      </w:pPr>
+      <w:r>
+        <w:t xml:space="preserve">Option 1 is nice because it’s really quick and easy. The downside, though, is that you don’t get much control in what the figure looks like, and these packages can often obscure what’s going on, leading to confusion (e.g. </w:t>
+      </w:r>
+      <w:r>
+        <w:t xml:space="preserve">“</w:t>
+      </w:r>
+      <w:r>
+        <w:t xml:space="preserve">How did you make this figure?</w:t>
+      </w:r>
+      <w:r>
+        <w:t xml:space="preserve">”</w:t>
+      </w:r>
+      <w:r>
+        <w:t xml:space="preserve">.</w:t>
+      </w:r>
+      <w:r>
+        <w:t xml:space="preserve"> </w:t>
+      </w:r>
+      <w:r>
+        <w:rPr>
+          <w:iCs/>
+          <w:i/>
+        </w:rPr>
+        <w:t xml:space="preserve">shrug</w:t>
+      </w:r>
+      <w:r>
+        <w:t xml:space="preserve">.).</w:t>
+      </w:r>
+    </w:p>
+    <w:p>
+      <w:pPr>
+        <w:pStyle w:val="BodyText"/>
+      </w:pPr>
+      <w:r>
+        <w:t xml:space="preserve">Option 2, on the other hand, can be more fiddly, but has the benefit of giving you flexibility, and makes the underlying process pretty transparent.</w:t>
+      </w:r>
+    </w:p>
+    <w:p>
+      <w:pPr>
+        <w:pStyle w:val="BodyText"/>
+      </w:pPr>
+      <w:r>
+        <w:t xml:space="preserve">We’ll start with Option 1.</w:t>
+      </w:r>
+    </w:p>
+    <w:bookmarkStart w:id="46" w:name="X904265fd1c38f657b0a0512398af9fee0fe9262"/>
+    <w:p>
+      <w:pPr>
+        <w:pStyle w:val="Heading2"/>
+      </w:pPr>
+      <w:r>
+        <w:t xml:space="preserve">Use an</w:t>
+      </w:r>
+      <w:r>
+        <w:t xml:space="preserve"> </w:t>
+      </w:r>
+      <w:r>
+        <w:rPr>
+          <w:rStyle w:val="VerbatimChar"/>
+        </w:rPr>
+        <w:t xml:space="preserve">R</w:t>
+      </w:r>
+      <w:r>
+        <w:t xml:space="preserve"> </w:t>
+      </w:r>
+      <w:r>
+        <w:t xml:space="preserve">package to create the figure for you.</w:t>
+      </w:r>
+    </w:p>
+    <w:p>
+      <w:pPr>
+        <w:pStyle w:val="FirstParagraph"/>
+      </w:pPr>
+      <w:r>
+        <w:t xml:space="preserve">First, install a package called</w:t>
+      </w:r>
+      <w:r>
+        <w:t xml:space="preserve"> </w:t>
+      </w:r>
+      <w:r>
+        <w:rPr>
+          <w:rStyle w:val="VerbatimChar"/>
+        </w:rPr>
+        <w:t xml:space="preserve">ggeffects</w:t>
+      </w:r>
+      <w:r>
+        <w:t xml:space="preserve">:</w:t>
+      </w:r>
+    </w:p>
+    <w:p>
+      <w:pPr>
+        <w:pStyle w:val="SourceCode"/>
+      </w:pPr>
+      <w:r>
+        <w:rPr>
+          <w:rStyle w:val="FunctionTok"/>
+        </w:rPr>
+        <w:t xml:space="preserve">install.packages</w:t>
+      </w:r>
+      <w:r>
+        <w:rPr>
+          <w:rStyle w:val="NormalTok"/>
+        </w:rPr>
+        <w:t xml:space="preserve">(</w:t>
+      </w:r>
+      <w:r>
+        <w:rPr>
+          <w:rStyle w:val="StringTok"/>
+        </w:rPr>
+        <w:t xml:space="preserve">"ggeffects"</w:t>
+      </w:r>
+      <w:r>
+        <w:rPr>
+          <w:rStyle w:val="NormalTok"/>
+        </w:rPr>
+        <w:t xml:space="preserve">)</w:t>
+      </w:r>
+    </w:p>
+    <w:p>
+      <w:pPr>
+        <w:pStyle w:val="FirstParagraph"/>
+      </w:pPr>
+      <w:r>
+        <w:t xml:space="preserve">As with other</w:t>
+      </w:r>
+      <w:r>
+        <w:t xml:space="preserve"> </w:t>
+      </w:r>
+      <w:r>
+        <w:rPr>
+          <w:rStyle w:val="VerbatimChar"/>
+        </w:rPr>
+        <w:t xml:space="preserve">R</w:t>
+      </w:r>
+      <w:r>
+        <w:t xml:space="preserve"> </w:t>
+      </w:r>
+      <w:r>
+        <w:t xml:space="preserve">packages, once it’s installed on your machine you shouldn’t need to install it again. When it’s finished loading, make sure to load it:</w:t>
+      </w:r>
+    </w:p>
+    <w:p>
+      <w:pPr>
+        <w:pStyle w:val="SourceCode"/>
+      </w:pPr>
+      <w:r>
+        <w:rPr>
+          <w:rStyle w:val="FunctionTok"/>
+        </w:rPr>
+        <w:t xml:space="preserve">library</w:t>
+      </w:r>
+      <w:r>
+        <w:rPr>
+          <w:rStyle w:val="NormalTok"/>
+        </w:rPr>
+        <w:t xml:space="preserve">(ggeffects)</w:t>
+      </w:r>
+    </w:p>
+    <w:p>
+      <w:pPr>
+        <w:pStyle w:val="FirstParagraph"/>
+      </w:pPr>
+      <w:r>
+        <w:t xml:space="preserve">Next, we’re going to use a function within</w:t>
+      </w:r>
+      <w:r>
+        <w:t xml:space="preserve"> </w:t>
+      </w:r>
+      <w:r>
+        <w:rPr>
+          <w:rStyle w:val="VerbatimChar"/>
+        </w:rPr>
+        <w:t xml:space="preserve">ggeffects</w:t>
+      </w:r>
+      <w:r>
+        <w:t xml:space="preserve"> </w:t>
+      </w:r>
+      <w:r>
+        <w:t xml:space="preserve">to create predictions from our model which we’ll store in a new object called</w:t>
+      </w:r>
+      <w:r>
+        <w:t xml:space="preserve"> </w:t>
+      </w:r>
+      <w:r>
+        <w:rPr>
+          <w:rStyle w:val="VerbatimChar"/>
+        </w:rPr>
+        <w:t xml:space="preserve">preds</w:t>
+      </w:r>
+      <w:r>
+        <w:t xml:space="preserve"> </w:t>
+      </w:r>
+      <w:r>
+        <w:t xml:space="preserve">(or whatever you prefer to call it), which we’ll plot subsequently. This is where storing the model output becomes really handy:</w:t>
+      </w:r>
+    </w:p>
+    <w:p>
+      <w:pPr>
+        <w:pStyle w:val="SourceCode"/>
+      </w:pPr>
+      <w:r>
+        <w:rPr>
+          <w:rStyle w:val="NormalTok"/>
+        </w:rPr>
+        <w:t xml:space="preserve">preds </w:t>
+      </w:r>
+      <w:r>
+        <w:rPr>
+          <w:rStyle w:val="OtherTok"/>
+        </w:rPr>
+        <w:t xml:space="preserve">&lt;-</w:t>
+      </w:r>
+      <w:r>
+        <w:rPr>
+          <w:rStyle w:val="NormalTok"/>
+        </w:rPr>
+        <w:t xml:space="preserve"> </w:t>
+      </w:r>
+      <w:r>
+        <w:rPr>
+          <w:rStyle w:val="FunctionTok"/>
+        </w:rPr>
+        <w:t xml:space="preserve">ggpredict</w:t>
+      </w:r>
+      <w:r>
+        <w:rPr>
+          <w:rStyle w:val="NormalTok"/>
+        </w:rPr>
+        <w:t xml:space="preserve">(boto_model)</w:t>
+      </w:r>
+    </w:p>
+    <w:p>
+      <w:pPr>
+        <w:pStyle w:val="FirstParagraph"/>
+      </w:pPr>
+      <w:r>
+        <w:t xml:space="preserve">Now we just need to plot it:</w:t>
+      </w:r>
+    </w:p>
+    <w:p>
+      <w:pPr>
+        <w:pStyle w:val="SourceCode"/>
+      </w:pPr>
+      <w:r>
+        <w:rPr>
+          <w:rStyle w:val="FunctionTok"/>
+        </w:rPr>
+        <w:t xml:space="preserve">plot</w:t>
+      </w:r>
+      <w:r>
+        <w:rPr>
+          <w:rStyle w:val="NormalTok"/>
+        </w:rPr>
+        <w:t xml:space="preserve">(preds)</w:t>
+      </w:r>
+    </w:p>
+    <w:p>
+      <w:pPr>
+        <w:pStyle w:val="FirstParagraph"/>
+      </w:pPr>
+      <w:r>
+        <w:drawing>
+          <wp:inline>
+            <wp:extent cx="4620126" cy="3696101"/>
+            <wp:effectExtent b="0" l="0" r="0" t="0"/>
+            <wp:docPr descr="" title="" id="44" name="Picture"/>
+            <a:graphic>
+              <a:graphicData uri="http://schemas.openxmlformats.org/drawingml/2006/picture">
+                <pic:pic>
+                  <pic:nvPicPr>
+                    <pic:cNvPr descr="Workshop-3---LM-with-a-continuous-predictor--with-answers-_files/figure-docx/unnamed-chunk-21-1.png" id="45" name="Picture"/>
+                    <pic:cNvPicPr>
+                      <a:picLocks noChangeArrowheads="1" noChangeAspect="1"/>
+                    </pic:cNvPicPr>
+                  </pic:nvPicPr>
+                  <pic:blipFill>
+                    <a:blip r:embed="rId43"/>
+                    <a:stretch>
+                      <a:fillRect/>
+                    </a:stretch>
+                  </pic:blipFill>
+                  <pic:spPr bwMode="auto">
+                    <a:xfrm>
+                      <a:off x="0" y="0"/>
+                      <a:ext cx="4620126" cy="3696101"/>
+                    </a:xfrm>
+                    <a:prstGeom prst="rect">
+                      <a:avLst/>
+                    </a:prstGeom>
+                    <a:noFill/>
+                    <a:ln w="9525">
+                      <a:noFill/>
+                      <a:headEnd/>
+                      <a:tailEnd/>
+                    </a:ln>
+                  </pic:spPr>
+                </pic:pic>
+              </a:graphicData>
+            </a:graphic>
+          </wp:inline>
+        </w:drawing>
+      </w:r>
+    </w:p>
+    <w:p>
+      <w:pPr>
+        <w:pStyle w:val="BodyText"/>
+      </w:pPr>
+      <w:r>
+        <w:t xml:space="preserve">And there we have it - with 95% confidence thrown in as a bonus! (We’ll cover 95% CI and what they mean next week). As easy as that. Buuuuut…. there are stylistic choices that I, personally and subjectively, don’t like. I wanna decide what’s going on, not some automated software!</w:t>
+      </w:r>
+    </w:p>
+    <w:bookmarkEnd w:id="46"/>
+    <w:bookmarkStart w:id="50" w:name="X7edb65d87e4270dc90baec660bef0aa39b5f258"/>
+    <w:p>
+      <w:pPr>
+        <w:pStyle w:val="Heading2"/>
+      </w:pPr>
+      <w:r>
+        <w:t xml:space="preserve">Create the prediction and figure yourself.</w:t>
+      </w:r>
+    </w:p>
+    <w:p>
+      <w:pPr>
+        <w:pStyle w:val="FirstParagraph"/>
+      </w:pPr>
+      <w:r>
+        <w:t xml:space="preserve">It’s actually not much harder to make the figure ourselves. We’ve actually already learnt all of the techniques we need to do so. Let’s get to it.</w:t>
+      </w:r>
+    </w:p>
+    <w:p>
+      <w:pPr>
+        <w:pStyle w:val="BodyText"/>
+      </w:pPr>
+      <w:r>
+        <w:t xml:space="preserve">For starters, we’re going to make a</w:t>
+      </w:r>
+      <w:r>
+        <w:t xml:space="preserve"> </w:t>
+      </w:r>
+      <w:r>
+        <w:rPr>
+          <w:iCs/>
+          <w:i/>
+        </w:rPr>
+        <w:t xml:space="preserve">fake</w:t>
+      </w:r>
+      <w:r>
+        <w:t xml:space="preserve"> </w:t>
+      </w:r>
+      <w:r>
+        <w:t xml:space="preserve">dataset. This dataset is going to contain, initially, just one variable;</w:t>
+      </w:r>
+      <w:r>
+        <w:t xml:space="preserve"> </w:t>
+      </w:r>
+      <w:r>
+        <w:rPr>
+          <w:rStyle w:val="VerbatimChar"/>
+        </w:rPr>
+        <w:t xml:space="preserve">drought</w:t>
+      </w:r>
+      <w:r>
+        <w:t xml:space="preserve">, and we’re going to keep it as simple as we can. We just want drought values of 0, 1, 2, 3, 4, 5, 6, 7 and 8. We can create this kind of data super easily in</w:t>
+      </w:r>
+      <w:r>
+        <w:t xml:space="preserve"> </w:t>
+      </w:r>
+      <w:r>
+        <w:rPr>
+          <w:rStyle w:val="VerbatimChar"/>
+        </w:rPr>
+        <w:t xml:space="preserve">R</w:t>
+      </w:r>
+      <w:r>
+        <w:t xml:space="preserve"> </w:t>
+      </w:r>
+      <w:r>
+        <w:t xml:space="preserve">using</w:t>
+      </w:r>
+      <w:r>
+        <w:t xml:space="preserve"> </w:t>
+      </w:r>
+      <w:r>
+        <w:rPr>
+          <w:rStyle w:val="VerbatimChar"/>
+        </w:rPr>
+        <w:t xml:space="preserve">0:8</w:t>
+      </w:r>
+      <w:r>
+        <w:t xml:space="preserve">. Try entering</w:t>
+      </w:r>
+      <w:r>
+        <w:t xml:space="preserve"> </w:t>
+      </w:r>
+      <w:r>
+        <w:rPr>
+          <w:rStyle w:val="VerbatimChar"/>
+        </w:rPr>
+        <w:t xml:space="preserve">0:8</w:t>
+      </w:r>
+      <w:r>
+        <w:t xml:space="preserve"> </w:t>
+      </w:r>
+      <w:r>
+        <w:t xml:space="preserve">in the console to see what it does, if you’re unsure. To create the</w:t>
+      </w:r>
+      <w:r>
+        <w:t xml:space="preserve"> </w:t>
+      </w:r>
+      <w:r>
+        <w:rPr>
+          <w:rStyle w:val="VerbatimChar"/>
+        </w:rPr>
+        <w:t xml:space="preserve">fake</w:t>
+      </w:r>
+      <w:r>
+        <w:t xml:space="preserve"> </w:t>
+      </w:r>
+      <w:r>
+        <w:t xml:space="preserve">dataset we use the</w:t>
+      </w:r>
+      <w:r>
+        <w:t xml:space="preserve"> </w:t>
+      </w:r>
+      <w:r>
+        <w:rPr>
+          <w:rStyle w:val="VerbatimChar"/>
+        </w:rPr>
+        <w:t xml:space="preserve">data.frame()</w:t>
+      </w:r>
+      <w:r>
+        <w:t xml:space="preserve"> </w:t>
+      </w:r>
+      <w:r>
+        <w:t xml:space="preserve">function. Bringing this all together, we get:</w:t>
+      </w:r>
+    </w:p>
+    <w:p>
+      <w:pPr>
+        <w:pStyle w:val="SourceCode"/>
+      </w:pPr>
+      <w:r>
+        <w:rPr>
+          <w:rStyle w:val="NormalTok"/>
+        </w:rPr>
+        <w:t xml:space="preserve">fake </w:t>
+      </w:r>
+      <w:r>
+        <w:rPr>
+          <w:rStyle w:val="OtherTok"/>
+        </w:rPr>
+        <w:t xml:space="preserve">&lt;-</w:t>
+      </w:r>
+      <w:r>
+        <w:rPr>
+          <w:rStyle w:val="NormalTok"/>
+        </w:rPr>
+        <w:t xml:space="preserve"> </w:t>
+      </w:r>
+      <w:r>
+        <w:rPr>
+          <w:rStyle w:val="FunctionTok"/>
+        </w:rPr>
+        <w:t xml:space="preserve">data.frame</w:t>
+      </w:r>
+      <w:r>
+        <w:rPr>
+          <w:rStyle w:val="NormalTok"/>
+        </w:rPr>
+        <w:t xml:space="preserve">(</w:t>
+      </w:r>
+      <w:r>
+        <w:br/>
+      </w:r>
+      <w:r>
+        <w:rPr>
+          <w:rStyle w:val="NormalTok"/>
+        </w:rPr>
+        <w:t xml:space="preserve">  </w:t>
+      </w:r>
+      <w:r>
+        <w:rPr>
+          <w:rStyle w:val="AttributeTok"/>
+        </w:rPr>
+        <w:t xml:space="preserve">drought =</w:t>
+      </w:r>
+      <w:r>
+        <w:rPr>
+          <w:rStyle w:val="NormalTok"/>
+        </w:rPr>
+        <w:t xml:space="preserve"> </w:t>
+      </w:r>
+      <w:r>
+        <w:rPr>
+          <w:rStyle w:val="DecValTok"/>
+        </w:rPr>
+        <w:t xml:space="preserve">0</w:t>
+      </w:r>
+      <w:r>
+        <w:rPr>
+          <w:rStyle w:val="SpecialCharTok"/>
+        </w:rPr>
+        <w:t xml:space="preserve">:</w:t>
+      </w:r>
+      <w:r>
+        <w:rPr>
+          <w:rStyle w:val="DecValTok"/>
+        </w:rPr>
+        <w:t xml:space="preserve">8</w:t>
+      </w:r>
+      <w:r>
+        <w:br/>
+      </w:r>
+      <w:r>
+        <w:rPr>
+          <w:rStyle w:val="NormalTok"/>
+        </w:rPr>
+        <w:t xml:space="preserve">)</w:t>
+      </w:r>
+    </w:p>
+    <w:p>
+      <w:pPr>
+        <w:pStyle w:val="FirstParagraph"/>
+      </w:pPr>
+      <w:r>
+        <w:t xml:space="preserve">In Question Set Three, you specified values of drought and used your equation to predict boto length by hand. What we’re going to do next is</w:t>
+      </w:r>
+      <w:r>
+        <w:t xml:space="preserve"> </w:t>
+      </w:r>
+      <w:r>
+        <w:rPr>
+          <w:iCs/>
+          <w:i/>
+        </w:rPr>
+        <w:t xml:space="preserve">exactly</w:t>
+      </w:r>
+      <w:r>
+        <w:t xml:space="preserve"> </w:t>
+      </w:r>
+      <w:r>
+        <w:t xml:space="preserve">the same, we’re just going to be</w:t>
+      </w:r>
+      <w:r>
+        <w:t xml:space="preserve"> </w:t>
+      </w:r>
+      <w:r>
+        <w:t xml:space="preserve">“</w:t>
+      </w:r>
+      <w:r>
+        <w:t xml:space="preserve">lazy</w:t>
+      </w:r>
+      <w:r>
+        <w:t xml:space="preserve">”</w:t>
+      </w:r>
+      <w:r>
+        <w:t xml:space="preserve"> </w:t>
+      </w:r>
+      <w:r>
+        <w:t xml:space="preserve">and have</w:t>
+      </w:r>
+      <w:r>
+        <w:t xml:space="preserve"> </w:t>
+      </w:r>
+      <w:r>
+        <w:rPr>
+          <w:rStyle w:val="VerbatimChar"/>
+        </w:rPr>
+        <w:t xml:space="preserve">R</w:t>
+      </w:r>
+      <w:r>
+        <w:t xml:space="preserve"> </w:t>
+      </w:r>
+      <w:r>
+        <w:t xml:space="preserve">do it for us using the</w:t>
+      </w:r>
+      <w:r>
+        <w:t xml:space="preserve"> </w:t>
+      </w:r>
+      <w:r>
+        <w:rPr>
+          <w:rStyle w:val="VerbatimChar"/>
+        </w:rPr>
+        <w:t xml:space="preserve">predict()</w:t>
+      </w:r>
+      <w:r>
+        <w:t xml:space="preserve"> </w:t>
+      </w:r>
+      <w:r>
+        <w:t xml:space="preserve">function. To be clear, it’s doing</w:t>
+      </w:r>
+      <w:r>
+        <w:t xml:space="preserve"> </w:t>
+      </w:r>
+      <w:r>
+        <w:rPr>
+          <w:iCs/>
+          <w:i/>
+        </w:rPr>
+        <w:t xml:space="preserve">exactly</w:t>
+      </w:r>
+      <w:r>
+        <w:t xml:space="preserve"> </w:t>
+      </w:r>
+      <w:r>
+        <w:t xml:space="preserve">the same thing you did; just taking a value of drought and predicting boto length. As with</w:t>
+      </w:r>
+      <w:r>
+        <w:t xml:space="preserve"> </w:t>
+      </w:r>
+      <w:r>
+        <w:rPr>
+          <w:rStyle w:val="VerbatimChar"/>
+        </w:rPr>
+        <w:t xml:space="preserve">ggeffects</w:t>
+      </w:r>
+      <w:r>
+        <w:t xml:space="preserve"> </w:t>
+      </w:r>
+      <w:r>
+        <w:t xml:space="preserve">we say what the model was, but we’re also going to tell</w:t>
+      </w:r>
+      <w:r>
+        <w:t xml:space="preserve"> </w:t>
+      </w:r>
+      <w:r>
+        <w:rPr>
+          <w:rStyle w:val="VerbatimChar"/>
+        </w:rPr>
+        <w:t xml:space="preserve">predict()</w:t>
+      </w:r>
+      <w:r>
+        <w:t xml:space="preserve"> </w:t>
+      </w:r>
+      <w:r>
+        <w:t xml:space="preserve">to use a new dataset to make the predictions; our</w:t>
+      </w:r>
+      <w:r>
+        <w:t xml:space="preserve"> </w:t>
+      </w:r>
+      <w:r>
+        <w:rPr>
+          <w:rStyle w:val="VerbatimChar"/>
+        </w:rPr>
+        <w:t xml:space="preserve">fake</w:t>
+      </w:r>
+      <w:r>
+        <w:t xml:space="preserve"> </w:t>
+      </w:r>
+      <w:r>
+        <w:t xml:space="preserve">dataset. We’re then going to add these predictions into the</w:t>
+      </w:r>
+      <w:r>
+        <w:t xml:space="preserve"> </w:t>
+      </w:r>
+      <w:r>
+        <w:rPr>
+          <w:rStyle w:val="VerbatimChar"/>
+        </w:rPr>
+        <w:t xml:space="preserve">fake</w:t>
+      </w:r>
+      <w:r>
+        <w:t xml:space="preserve"> </w:t>
+      </w:r>
+      <w:r>
+        <w:t xml:space="preserve">dataset to make plotting easier for us.</w:t>
+      </w:r>
+    </w:p>
+    <w:p>
+      <w:pPr>
+        <w:pStyle w:val="SourceCode"/>
+      </w:pPr>
+      <w:r>
+        <w:rPr>
+          <w:rStyle w:val="NormalTok"/>
+        </w:rPr>
+        <w:t xml:space="preserve">fake</w:t>
+      </w:r>
+      <w:r>
+        <w:rPr>
+          <w:rStyle w:val="SpecialCharTok"/>
+        </w:rPr>
+        <w:t xml:space="preserve">$</w:t>
+      </w:r>
+      <w:r>
+        <w:rPr>
+          <w:rStyle w:val="NormalTok"/>
+        </w:rPr>
+        <w:t xml:space="preserve">fit </w:t>
+      </w:r>
+      <w:r>
+        <w:rPr>
+          <w:rStyle w:val="OtherTok"/>
+        </w:rPr>
+        <w:t xml:space="preserve">&lt;-</w:t>
+      </w:r>
+      <w:r>
+        <w:rPr>
+          <w:rStyle w:val="NormalTok"/>
+        </w:rPr>
+        <w:t xml:space="preserve"> </w:t>
+      </w:r>
+      <w:r>
+        <w:rPr>
+          <w:rStyle w:val="FunctionTok"/>
+        </w:rPr>
+        <w:t xml:space="preserve">predict</w:t>
+      </w:r>
+      <w:r>
+        <w:rPr>
+          <w:rStyle w:val="NormalTok"/>
+        </w:rPr>
+        <w:t xml:space="preserve">(boto_model, </w:t>
+      </w:r>
+      <w:r>
+        <w:rPr>
+          <w:rStyle w:val="AttributeTok"/>
+        </w:rPr>
+        <w:t xml:space="preserve">newdata =</w:t>
+      </w:r>
+      <w:r>
+        <w:rPr>
+          <w:rStyle w:val="NormalTok"/>
+        </w:rPr>
+        <w:t xml:space="preserve"> fake)</w:t>
+      </w:r>
+    </w:p>
+    <w:p>
+      <w:pPr>
+        <w:pStyle w:val="FirstParagraph"/>
+      </w:pPr>
+      <w:r>
+        <w:t xml:space="preserve">Now we have a dataset that contains all values of</w:t>
+      </w:r>
+      <w:r>
+        <w:t xml:space="preserve"> </w:t>
+      </w:r>
+      <w:r>
+        <w:rPr>
+          <w:rStyle w:val="VerbatimChar"/>
+        </w:rPr>
+        <w:t xml:space="preserve">drought</w:t>
+      </w:r>
+      <w:r>
+        <w:t xml:space="preserve"> </w:t>
+      </w:r>
+      <w:r>
+        <w:t xml:space="preserve">we’re interested in, as well as the predicted length (called</w:t>
+      </w:r>
+      <w:r>
+        <w:t xml:space="preserve"> </w:t>
+      </w:r>
+      <w:r>
+        <w:rPr>
+          <w:rStyle w:val="VerbatimChar"/>
+        </w:rPr>
+        <w:t xml:space="preserve">fit</w:t>
+      </w:r>
+      <w:r>
+        <w:t xml:space="preserve"> </w:t>
+      </w:r>
+      <w:r>
+        <w:t xml:space="preserve">in my code above). So we have a dataset (</w:t>
+      </w:r>
+      <w:r>
+        <w:rPr>
+          <w:rStyle w:val="VerbatimChar"/>
+        </w:rPr>
+        <w:t xml:space="preserve">fake</w:t>
+      </w:r>
+      <w:r>
+        <w:t xml:space="preserve">) and we want to make a plot. You guys know how to do this, using</w:t>
+      </w:r>
+      <w:r>
+        <w:t xml:space="preserve"> </w:t>
+      </w:r>
+      <w:r>
+        <w:rPr>
+          <w:rStyle w:val="VerbatimChar"/>
+        </w:rPr>
+        <w:t xml:space="preserve">ggplot2</w:t>
+      </w:r>
+      <w:r>
+        <w:t xml:space="preserve">!</w:t>
+      </w:r>
+    </w:p>
+    <w:p>
+      <w:pPr>
+        <w:pStyle w:val="SourceCode"/>
+      </w:pPr>
+      <w:r>
+        <w:rPr>
+          <w:rStyle w:val="FunctionTok"/>
+        </w:rPr>
+        <w:t xml:space="preserve">ggplot</w:t>
+      </w:r>
+      <w:r>
+        <w:rPr>
+          <w:rStyle w:val="NormalTok"/>
+        </w:rPr>
+        <w:t xml:space="preserve">(fake) </w:t>
+      </w:r>
+      <w:r>
+        <w:rPr>
+          <w:rStyle w:val="SpecialCharTok"/>
+        </w:rPr>
+        <w:t xml:space="preserve">+</w:t>
+      </w:r>
+      <w:r>
+        <w:br/>
+      </w:r>
+      <w:r>
+        <w:rPr>
+          <w:rStyle w:val="NormalTok"/>
+        </w:rPr>
+        <w:t xml:space="preserve">  </w:t>
+      </w:r>
+      <w:r>
+        <w:rPr>
+          <w:rStyle w:val="FunctionTok"/>
+        </w:rPr>
+        <w:t xml:space="preserve">geom_line</w:t>
+      </w:r>
+      <w:r>
+        <w:rPr>
+          <w:rStyle w:val="NormalTok"/>
+        </w:rPr>
+        <w:t xml:space="preserve">(</w:t>
+      </w:r>
+      <w:r>
+        <w:rPr>
+          <w:rStyle w:val="FunctionTok"/>
+        </w:rPr>
+        <w:t xml:space="preserve">aes</w:t>
+      </w:r>
+      <w:r>
+        <w:rPr>
+          <w:rStyle w:val="NormalTok"/>
+        </w:rPr>
+        <w:t xml:space="preserve">(</w:t>
+      </w:r>
+      <w:r>
+        <w:rPr>
+          <w:rStyle w:val="AttributeTok"/>
+        </w:rPr>
+        <w:t xml:space="preserve">x =</w:t>
+      </w:r>
+      <w:r>
+        <w:rPr>
+          <w:rStyle w:val="NormalTok"/>
+        </w:rPr>
+        <w:t xml:space="preserve"> drought, </w:t>
+      </w:r>
+      <w:r>
+        <w:rPr>
+          <w:rStyle w:val="AttributeTok"/>
+        </w:rPr>
+        <w:t xml:space="preserve">y =</w:t>
+      </w:r>
+      <w:r>
+        <w:rPr>
+          <w:rStyle w:val="NormalTok"/>
+        </w:rPr>
+        <w:t xml:space="preserve"> fit)) </w:t>
+      </w:r>
+      <w:r>
+        <w:rPr>
+          <w:rStyle w:val="SpecialCharTok"/>
+        </w:rPr>
+        <w:t xml:space="preserve">+</w:t>
+      </w:r>
+      <w:r>
+        <w:br/>
+      </w:r>
+      <w:r>
+        <w:rPr>
+          <w:rStyle w:val="NormalTok"/>
+        </w:rPr>
+        <w:t xml:space="preserve">  </w:t>
+      </w:r>
+      <w:r>
+        <w:rPr>
+          <w:rStyle w:val="FunctionTok"/>
+        </w:rPr>
+        <w:t xml:space="preserve">labs</w:t>
+      </w:r>
+      <w:r>
+        <w:rPr>
+          <w:rStyle w:val="NormalTok"/>
+        </w:rPr>
+        <w:t xml:space="preserve">(</w:t>
+      </w:r>
+      <w:r>
+        <w:rPr>
+          <w:rStyle w:val="AttributeTok"/>
+        </w:rPr>
+        <w:t xml:space="preserve">x =</w:t>
+      </w:r>
+      <w:r>
+        <w:rPr>
+          <w:rStyle w:val="NormalTok"/>
+        </w:rPr>
+        <w:t xml:space="preserve"> </w:t>
+      </w:r>
+      <w:r>
+        <w:rPr>
+          <w:rStyle w:val="StringTok"/>
+        </w:rPr>
+        <w:t xml:space="preserve">"Number of drought years"</w:t>
+      </w:r>
+      <w:r>
+        <w:rPr>
+          <w:rStyle w:val="NormalTok"/>
+        </w:rPr>
+        <w:t xml:space="preserve">,</w:t>
+      </w:r>
+      <w:r>
+        <w:br/>
+      </w:r>
+      <w:r>
+        <w:rPr>
+          <w:rStyle w:val="NormalTok"/>
+        </w:rPr>
+        <w:t xml:space="preserve">       </w:t>
+      </w:r>
+      <w:r>
+        <w:rPr>
+          <w:rStyle w:val="AttributeTok"/>
+        </w:rPr>
+        <w:t xml:space="preserve">y =</w:t>
+      </w:r>
+      <w:r>
+        <w:rPr>
+          <w:rStyle w:val="NormalTok"/>
+        </w:rPr>
+        <w:t xml:space="preserve"> </w:t>
+      </w:r>
+      <w:r>
+        <w:rPr>
+          <w:rStyle w:val="StringTok"/>
+        </w:rPr>
+        <w:t xml:space="preserve">"Predicted length of boto (cm)"</w:t>
+      </w:r>
+      <w:r>
+        <w:rPr>
+          <w:rStyle w:val="NormalTok"/>
+        </w:rPr>
+        <w:t xml:space="preserve">,</w:t>
+      </w:r>
+      <w:r>
+        <w:br/>
+      </w:r>
+      <w:r>
+        <w:rPr>
+          <w:rStyle w:val="NormalTok"/>
+        </w:rPr>
+        <w:t xml:space="preserve">       </w:t>
+      </w:r>
+      <w:r>
+        <w:rPr>
+          <w:rStyle w:val="AttributeTok"/>
+        </w:rPr>
+        <w:t xml:space="preserve">title =</w:t>
+      </w:r>
+      <w:r>
+        <w:rPr>
+          <w:rStyle w:val="NormalTok"/>
+        </w:rPr>
+        <w:t xml:space="preserve"> </w:t>
+      </w:r>
+      <w:r>
+        <w:rPr>
+          <w:rStyle w:val="StringTok"/>
+        </w:rPr>
+        <w:t xml:space="preserve">"Estimated association between boto length and drought"</w:t>
+      </w:r>
+      <w:r>
+        <w:rPr>
+          <w:rStyle w:val="NormalTok"/>
+        </w:rPr>
+        <w:t xml:space="preserve">) </w:t>
+      </w:r>
+      <w:r>
+        <w:rPr>
+          <w:rStyle w:val="SpecialCharTok"/>
+        </w:rPr>
+        <w:t xml:space="preserve">+</w:t>
+      </w:r>
+      <w:r>
+        <w:br/>
+      </w:r>
+      <w:r>
+        <w:rPr>
+          <w:rStyle w:val="NormalTok"/>
+        </w:rPr>
+        <w:t xml:space="preserve">  </w:t>
+      </w:r>
+      <w:r>
+        <w:rPr>
+          <w:rStyle w:val="FunctionTok"/>
+        </w:rPr>
+        <w:t xml:space="preserve">theme_minimal</w:t>
+      </w:r>
+      <w:r>
+        <w:rPr>
+          <w:rStyle w:val="NormalTok"/>
+        </w:rPr>
+        <w:t xml:space="preserve">()</w:t>
+      </w:r>
+    </w:p>
+    <w:p>
+      <w:pPr>
+        <w:pStyle w:val="FirstParagraph"/>
+      </w:pPr>
+      <w:r>
+        <w:drawing>
+          <wp:inline>
+            <wp:extent cx="4620126" cy="3696101"/>
+            <wp:effectExtent b="0" l="0" r="0" t="0"/>
+            <wp:docPr descr="" title="" id="48" name="Picture"/>
+            <a:graphic>
+              <a:graphicData uri="http://schemas.openxmlformats.org/drawingml/2006/picture">
+                <pic:pic>
+                  <pic:nvPicPr>
+                    <pic:cNvPr descr="Workshop-3---LM-with-a-continuous-predictor--with-answers-_files/figure-docx/unnamed-chunk-24-1.png" id="49" name="Picture"/>
+                    <pic:cNvPicPr>
+                      <a:picLocks noChangeArrowheads="1" noChangeAspect="1"/>
+                    </pic:cNvPicPr>
+                  </pic:nvPicPr>
+                  <pic:blipFill>
+                    <a:blip r:embed="rId47"/>
+                    <a:stretch>
+                      <a:fillRect/>
+                    </a:stretch>
+                  </pic:blipFill>
+                  <pic:spPr bwMode="auto">
+                    <a:xfrm>
+                      <a:off x="0" y="0"/>
+                      <a:ext cx="4620126" cy="3696101"/>
+                    </a:xfrm>
+                    <a:prstGeom prst="rect">
+                      <a:avLst/>
+                    </a:prstGeom>
+                    <a:noFill/>
+                    <a:ln w="9525">
+                      <a:noFill/>
+                      <a:headEnd/>
+                      <a:tailEnd/>
+                    </a:ln>
+                  </pic:spPr>
+                </pic:pic>
+              </a:graphicData>
+            </a:graphic>
+          </wp:inline>
+        </w:drawing>
+      </w:r>
+    </w:p>
+    <w:p>
+      <w:pPr>
+        <w:pStyle w:val="BodyText"/>
+      </w:pPr>
+      <w:r>
         <w:t xml:space="preserve">The full process here, from loading a dataset to getting a figure that enables us to see the association between drought and boto length can be done in a surprisingly few lines of code. Here’s my how I’d code this:</w:t>
       </w:r>
     </w:p>
@@ -6087,9 +6765,9 @@
         <w:t xml:space="preserve">script had something like 1,000 lines of code. It wasn’t because I was doing anything particularly complicated (my analysis was more or less equivalent to the model you just ran) but because I didn’t really know what I was doing, so I threw everything I could find at it. Often less is more in coding.</w:t>
       </w:r>
     </w:p>
-    <w:bookmarkEnd w:id="43"/>
-    <w:bookmarkEnd w:id="44"/>
-    <w:bookmarkStart w:id="45" w:name="a-new-challenger"/>
+    <w:bookmarkEnd w:id="50"/>
+    <w:bookmarkEnd w:id="51"/>
+    <w:bookmarkStart w:id="52" w:name="a-new-challenger"/>
     <w:p>
       <w:pPr>
         <w:pStyle w:val="Heading1"/>
@@ -7212,8 +7890,8 @@
         <w:t xml:space="preserve"># (But given you don't know how to do that, we should stop here and advice/insist the results are not interpreted)</w:t>
       </w:r>
     </w:p>
-    <w:bookmarkEnd w:id="45"/>
-    <w:bookmarkStart w:id="46" w:name="assumption-table"/>
+    <w:bookmarkEnd w:id="52"/>
+    <w:bookmarkStart w:id="53" w:name="assumption-table"/>
     <w:p>
       <w:pPr>
         <w:pStyle w:val="Heading1"/>
@@ -7636,7 +8314,7 @@
         </w:tc>
       </w:tr>
     </w:tbl>
-    <w:bookmarkEnd w:id="46"/>
+    <w:bookmarkEnd w:id="53"/>
     <w:sectPr>
       <w:pgSz w:h="15840" w:w="12240"/>
       <w:pgMar w:bottom="1440" w:footer="720" w:gutter="0" w:header="720" w:left="1440" w:right="1440" w:top="1440"/>

</xml_diff>